<commit_message>
docs(case-report): remove redundant Z부록 (검증/정직성) duplicating §6·§7
- case-report.docx/pdf 말미의 'Z부록. 검증 결과와 정직성 선언' 3문단 제거
- 사유: 본문 §6 결과물과 검증 / §7 한계와 정직성 / 정직성 선언과 중복, '40개 이상' 수치도 stale(현행 115개)
- XML 직접 편집으로 표/구조 무손상, §7로 자연스럽게 종료
</commit_message>
<xml_diff>
--- a/docs/submission/final/case-report.docx
+++ b/docs/submission/final/case-report.docx
@@ -1067,98 +1067,6 @@
     </w:p>
     <w:bookmarkEnd w:id="31"/>
     <w:bookmarkStart w:id="32" w:name="부록.-검증-결과와-정직성-선언"/>
-    <w:p>
-      <w:pPr>
-        <w:pStyle w:val="Heading2"/>
-      </w:pPr>
-      <w:r>
-        <w:t xml:space="preserve">부록. 검증 결과와 정직성 선언</w:t>
-      </w:r>
-    </w:p>
-    <w:p>
-      <w:pPr>
-        <w:pStyle w:val="FirstParagraph"/>
-      </w:pPr>
-      <w:r>
-        <w:rPr>
-          <w:bCs/>
-          <w:b/>
-        </w:rPr>
-        <w:t xml:space="preserve">검증 결과.</w:t>
-      </w:r>
-      <w:r>
-        <w:t xml:space="preserve"> </w:t>
-      </w:r>
-      <w:r>
-        <w:t xml:space="preserve">본 프로젝트는</w:t>
-      </w:r>
-      <w:r>
-        <w:t xml:space="preserve"> </w:t>
-      </w:r>
-      <w:r>
-        <w:rPr>
-          <w:rStyle w:val="VerbatimChar"/>
-        </w:rPr>
-        <w:t xml:space="preserve">npm test</w:t>
-      </w:r>
-      <w:r>
-        <w:t xml:space="preserve">로 40개 이상의 단위 테스트를 통과했고,</w:t>
-      </w:r>
-      <w:r>
-        <w:t xml:space="preserve"> </w:t>
-      </w:r>
-      <w:r>
-        <w:rPr>
-          <w:rStyle w:val="VerbatimChar"/>
-        </w:rPr>
-        <w:t xml:space="preserve">npm run build</w:t>
-      </w:r>
-      <w:r>
-        <w:t xml:space="preserve">로 빌드도 정상적으로 완료되었다. 주요 검증 항목은 AI 분석 엔진의 결정론성, 저장소의 데이터 복구, 내보내기 형식, 실제 과목 데이터의 역량 커버리지 등이다.</w:t>
-      </w:r>
-    </w:p>
-    <w:p>
-      <w:pPr>
-        <w:pStyle w:val="BodyText"/>
-      </w:pPr>
-      <w:r>
-        <w:rPr>
-          <w:bCs/>
-          <w:b/>
-        </w:rPr>
-        <w:t xml:space="preserve">정직성 선언.</w:t>
-      </w:r>
-      <w:r>
-        <w:t xml:space="preserve"> </w:t>
-      </w:r>
-      <w:r>
-        <w:t xml:space="preserve">- 본 결과물에 AI를 활용하였으며, 이 사실을 명시한다.</w:t>
-      </w:r>
-      <w:r>
-        <w:t xml:space="preserve"> </w:t>
-      </w:r>
-      <w:r>
-        <w:t xml:space="preserve">- AI가 생성한 코드와 텍스트를 그대로 제출하지 않았다. 모든 AI 출력은 본인이 직접 검토하고 정확성을 확인한 뒤, 필요한 부분을 수정·보완하여 최종 반영했다.</w:t>
-      </w:r>
-      <w:r>
-        <w:t xml:space="preserve"> </w:t>
-      </w:r>
-      <w:r>
-        <w:t xml:space="preserve">- 출석이나 진도율을 부정한 방식으로 채우거나, 외부 스크립트를 이용한 출품 근거가 아니다.</w:t>
-      </w:r>
-      <w:r>
-        <w:t xml:space="preserve"> </w:t>
-      </w:r>
-      <w:r>
-        <w:t xml:space="preserve">- 수강 과목명은 본인의 HYCU 수강 이력을 기반으로 하며, 과목별 학습 내용은 본인이 직접 작성했다.</w:t>
-      </w:r>
-      <w:r>
-        <w:t xml:space="preserve"> </w:t>
-      </w:r>
-      <w:r>
-        <w:t xml:space="preserve">- 개인정보와 인증정보는 결과물에 포함하지 않았다.</w:t>
-      </w:r>
-    </w:p>
     <w:bookmarkEnd w:id="32"/>
     <w:bookmarkEnd w:id="33"/>
     <w:sectPr/>

</xml_diff>